<commit_message>
Add Symbiosis branding and clickable repository link to CA3 report
</commit_message>
<xml_diff>
--- a/docs/ProcureGuard_AI_CA3_Report.docx
+++ b/docs/ProcureGuard_AI_CA3_Report.docx
@@ -2,6 +2,46 @@
 <file path=word/document.xml><?xml version="1.0" encoding="utf-8"?>
 <w:document xmlns:wpc="http://schemas.microsoft.com/office/word/2010/wordprocessingCanvas" xmlns:mo="http://schemas.microsoft.com/office/mac/office/2008/main" xmlns:mc="http://schemas.openxmlformats.org/markup-compatibility/2006" xmlns:mv="urn:schemas-microsoft-com:mac:vml" xmlns:o="urn:schemas-microsoft-com:office:office" xmlns:r="http://schemas.openxmlformats.org/officeDocument/2006/relationships" xmlns:m="http://schemas.openxmlformats.org/officeDocument/2006/math" xmlns:v="urn:schemas-microsoft-com:vml" xmlns:wp14="http://schemas.microsoft.com/office/word/2010/wordprocessingDrawing" xmlns:wp="http://schemas.openxmlformats.org/drawingml/2006/wordprocessingDrawing" xmlns:w10="urn:schemas-microsoft-com:office:word" xmlns:w="http://schemas.openxmlformats.org/wordprocessingml/2006/main" xmlns:w14="http://schemas.microsoft.com/office/word/2010/wordml" xmlns:wpg="http://schemas.microsoft.com/office/word/2010/wordprocessingGroup" xmlns:wpi="http://schemas.microsoft.com/office/word/2010/wordprocessingInk" xmlns:wne="http://schemas.microsoft.com/office/word/2006/wordml" xmlns:wps="http://schemas.microsoft.com/office/word/2010/wordprocessingShape" mc:Ignorable="w14 wp14">
   <w:body>
+    <w:p>
+      <w:pPr>
+        <w:spacing w:after="80"/>
+        <w:jc w:val="center"/>
+      </w:pPr>
+      <w:r>
+        <w:drawing>
+          <wp:inline xmlns:a="http://schemas.openxmlformats.org/drawingml/2006/main" xmlns:pic="http://schemas.openxmlformats.org/drawingml/2006/picture">
+            <wp:extent cx="5486400" cy="868779"/>
+            <wp:docPr id="1" name="Picture 1" descr="Symbiosis Institute of Technology official logo and institution name"/>
+            <wp:cNvGraphicFramePr>
+              <a:graphicFrameLocks noChangeAspect="1"/>
+            </wp:cNvGraphicFramePr>
+            <a:graphic>
+              <a:graphicData uri="http://schemas.openxmlformats.org/drawingml/2006/picture">
+                <pic:pic>
+                  <pic:nvPicPr>
+                    <pic:cNvPr id="0" name="sit_pune_official_logo.png"/>
+                    <pic:cNvPicPr/>
+                  </pic:nvPicPr>
+                  <pic:blipFill>
+                    <a:blip r:embed="rId11"/>
+                    <a:stretch>
+                      <a:fillRect/>
+                    </a:stretch>
+                  </pic:blipFill>
+                  <pic:spPr>
+                    <a:xfrm>
+                      <a:off x="0" y="0"/>
+                      <a:ext cx="5486400" cy="868779"/>
+                    </a:xfrm>
+                    <a:prstGeom prst="rect"/>
+                  </pic:spPr>
+                </pic:pic>
+              </a:graphicData>
+            </a:graphic>
+          </wp:inline>
+        </w:drawing>
+      </w:r>
+    </w:p>
     <w:p>
       <w:pPr>
         <w:pStyle w:val="Title"/>
@@ -20,12 +60,30 @@
     </w:p>
     <w:p>
       <w:r>
-        <w:t>Prepared for the CA3 project submission</w:t>
-        <w:br/>
-        <w:t>AIML C, Symbiosis Institute of Technology Pune</w:t>
-        <w:br/>
-        <w:t>19 October 2026</w:t>
+        <w:t>CA3 project submission  |  AIML C  |  19 October 2026</w:t>
       </w:r>
+    </w:p>
+    <w:p>
+      <w:pPr>
+        <w:spacing w:after="160"/>
+      </w:pPr>
+      <w:r>
+        <w:rPr>
+          <w:b/>
+          <w:sz w:val="20"/>
+        </w:rPr>
+        <w:t xml:space="preserve">GitHub repository  </w:t>
+      </w:r>
+      <w:hyperlink r:id="rId12">
+        <w:r>
+          <w:rPr>
+            <w:color w:val="0563C1"/>
+            <w:u w:val="single"/>
+            <w:sz w:val="20"/>
+          </w:rPr>
+          <w:t>https://github.com/siddartttk/ProcureGuard-AI-CA3</w:t>
+        </w:r>
+      </w:hyperlink>
     </w:p>
     <w:tbl>
       <w:tblPr>
@@ -241,8 +299,13 @@
     </w:tbl>
     <w:p>
       <w:pPr>
-        <w:spacing w:after="40"/>
+        <w:spacing w:after="0" w:line="40" w:lineRule="exact"/>
       </w:pPr>
+      <w:r>
+        <w:rPr>
+          <w:sz w:val="4"/>
+        </w:rPr>
+      </w:r>
     </w:p>
     <w:p>
       <w:pPr>
@@ -294,13 +357,9 @@
       </w:r>
     </w:p>
     <w:p>
-      <w:r>
-        <w:br w:type="page"/>
-      </w:r>
-    </w:p>
-    <w:p>
       <w:pPr>
         <w:pStyle w:val="Heading1"/>
+        <w:pageBreakBefore/>
       </w:pPr>
       <w:r>
         <w:t>Architecture and agent responsibilities</w:t>
@@ -316,7 +375,7 @@
         <w:drawing>
           <wp:inline xmlns:a="http://schemas.openxmlformats.org/drawingml/2006/main" xmlns:pic="http://schemas.openxmlformats.org/drawingml/2006/picture">
             <wp:extent cx="6263640" cy="3523298"/>
-            <wp:docPr id="1" name="Picture 1" descr="Investigation flow showing matching, critic, planner, evidence validation, human review and SQLite case history"/>
+            <wp:docPr id="2" name="Picture 2" descr="Investigation flow showing matching, critic, planner, evidence validation, human review and SQLite case history"/>
             <wp:cNvGraphicFramePr>
               <a:graphicFrameLocks noChangeAspect="1"/>
             </wp:cNvGraphicFramePr>
@@ -328,7 +387,7 @@
                     <pic:cNvPicPr/>
                   </pic:nvPicPr>
                   <pic:blipFill>
-                    <a:blip r:embed="rId11"/>
+                    <a:blip r:embed="rId13"/>
                     <a:stretch>
                       <a:fillRect/>
                     </a:stretch>
@@ -382,13 +441,9 @@
       </w:r>
     </w:p>
     <w:p>
-      <w:r>
-        <w:br w:type="page"/>
-      </w:r>
-    </w:p>
-    <w:p>
       <w:pPr>
         <w:pStyle w:val="Heading1"/>
+        <w:pageBreakBefore/>
       </w:pPr>
       <w:r>
         <w:t>Reconciliation and persistent case controls</w:t>
@@ -457,13 +512,9 @@
       </w:r>
     </w:p>
     <w:p>
-      <w:r>
-        <w:br w:type="page"/>
-      </w:r>
-    </w:p>
-    <w:p>
       <w:pPr>
         <w:pStyle w:val="Heading1"/>
+        <w:pageBreakBefore/>
       </w:pPr>
       <w:r>
         <w:t>Demonstration and evolving investigations</w:t>
@@ -532,13 +583,9 @@
       </w:r>
     </w:p>
     <w:p>
-      <w:r>
-        <w:br w:type="page"/>
-      </w:r>
-    </w:p>
-    <w:p>
       <w:pPr>
         <w:pStyle w:val="Heading1"/>
+        <w:pageBreakBefore/>
       </w:pPr>
       <w:r>
         <w:t>Validation results and limitations</w:t>
@@ -1128,13 +1175,9 @@
       </w:r>
     </w:p>
     <w:p>
-      <w:r>
-        <w:br w:type="page"/>
-      </w:r>
-    </w:p>
-    <w:p>
       <w:pPr>
         <w:pStyle w:val="Heading1"/>
+        <w:pageBreakBefore/>
       </w:pPr>
       <w:r>
         <w:t>Running and reviewing the submission</w:t>

</xml_diff>